<commit_message>
Add live deployment link to report and README
</commit_message>
<xml_diff>
--- a/reports/AQI_Predictor_Report.docx
+++ b/reports/AQI_Predictor_Report.docx
@@ -2575,6 +2575,14 @@
       </w:pPr>
       <w:r>
         <w:t xml:space="preserve">This design means the system continuously improves and stays current without any manual retraining or redeployment steps.</w:t>
+      </w:r>
+    </w:p>
+    <w:p>
+      <w:pPr>
+        <w:spacing w:after="160"/>
+      </w:pPr>
+      <w:r>
+        <w:t xml:space="preserve">The dashboard is publicly deployed on Streamlit Community Cloud and can be viewed live at: https://aqi-predictor-72d8k3vx5ndax4obtuddf4.streamlit.app/</w:t>
       </w:r>
     </w:p>
     <w:p>

</xml_diff>